<commit_message>
Add yellow highlighting to citation lines and switch visual regression to AE
Citation placeholder runs ("Для цитирования" / "For citation") now include
w:highlight yellow, matching the official ISP RAS template. The highlighting
carries through to final output since main.ts preserves run properties.

Switch visual-regression.sh from RMSE to AE (absolute error) metric — AE
measures percentage of differing pixels, giving clearer separation between
matching template pages (2-4%) and different-content pages (10-17%).
</commit_message>
<xml_diff>
--- a/resources/isp-reference.docx
+++ b/resources/isp-reference.docx
@@ -204,6 +204,7 @@
       <w:r>
         <w:rPr>
           <w:b w:val="false"/>
+          <w:highlight w:val="yellow"/>
         </w:rPr>
         <w:t xml:space="preserve">{{{for_citation_ru}}}</w:t>
       </w:r>
@@ -379,6 +380,7 @@
       <w:r>
         <w:rPr>
           <w:b w:val="false"/>
+          <w:highlight w:val="yellow"/>
         </w:rPr>
         <w:t xml:space="preserve">{{{for_citation_en}}}</w:t>
       </w:r>
@@ -15907,7 +15909,7 @@
         <w:ilvl w:val="0"/>
         <w:numId w:val="0"/>
       </w:numPr>
-      <w:ind w:hanging="284" w:left="284"/>
+      <w:ind w:hanging="0" w:left="0"/>
     </w:pPr>
     <w:rPr>
       <w:i w:val="false"/>
@@ -15948,7 +15950,9 @@
     <w:next w:val="ispTextmain"/>
     <w:qFormat/>
     <w:rsid w:val="009a688a"/>
-    <w:pPr/>
+    <w:pPr>
+      <w:ind w:hanging="0" w:left="0"/>
+    </w:pPr>
     <w:rPr>
       <w:i/>
       <w:sz w:val="22"/>
@@ -15960,7 +15964,9 @@
     <w:next w:val="ispTextmain"/>
     <w:qFormat/>
     <w:rsid w:val="009a688a"/>
-    <w:pPr/>
+    <w:pPr>
+      <w:ind w:hanging="0" w:left="0"/>
+    </w:pPr>
     <w:rPr>
       <w:i w:val="false"/>
     </w:rPr>

</xml_diff>

<commit_message>
Fix EN annotation font size by applying ispAnotation2 style (10pt → 9pt)
EN annotations (Abstract, Keywords, For citation, Acknowledgements) were
rendering at 10pt because replaceAnnotationValue() rebuilt runs without
a font size, falling back to Normal's 10pt. Apply the ispAnotation2
paragraph style (inherits 9pt from ispAnotation) to EN annotation
paragraphs in the reference template, matching the official template.
</commit_message>
<xml_diff>
--- a/resources/isp-reference.docx
+++ b/resources/isp-reference.docx
@@ -317,7 +317,7 @@
     </w:p>
     <w:p>
       <w:pPr>
-        <w:pStyle w:val="ispAnotation1"/>
+        <w:pStyle w:val="ispAnotation21"/>
         <w:spacing w:beforeAutospacing="0" w:before="240" w:afterAutospacing="0" w:after="120"/>
         <w:rPr>
           <w:b w:val="false"/>
@@ -338,7 +338,7 @@
     </w:p>
     <w:p>
       <w:pPr>
-        <w:pStyle w:val="Normal"/>
+        <w:pStyle w:val="ispAnotation21"/>
         <w:spacing w:before="120" w:after="30"/>
         <w:jc w:val="both"/>
         <w:rPr>
@@ -362,7 +362,7 @@
     </w:p>
     <w:p>
       <w:pPr>
-        <w:pStyle w:val="Normal"/>
+        <w:pStyle w:val="ispAnotation21"/>
         <w:spacing w:before="120" w:after="30"/>
         <w:jc w:val="both"/>
         <w:rPr>
@@ -387,7 +387,7 @@
     </w:p>
     <w:p>
       <w:pPr>
-        <w:pStyle w:val="Normal"/>
+        <w:pStyle w:val="ispAnotation21"/>
         <w:spacing w:before="120" w:after="30"/>
         <w:jc w:val="both"/>
         <w:rPr>

</xml_diff>

<commit_message>
Auto-generate for_citation prefix from metadata
Bake the journal suffix (with formatting and highlighting from the
official template) into isp-reference.docx, and auto-generate the
"Authors. Title. " prefix from existing authors/header metadata,
reusing generatePageHeaderPrefix().

- Add replace_citation action in generate-reference.ts that splits
  citation paragraphs at the journal name boundary, keeping suffix
  runs with original formatting (italic journal name, highlighted
  volume/DOI)
- Auto-generate for_citation_ru/en in replaceTemplates() when not
  explicitly provided (backward compatible)
- Remove for_citation_* from sample files (now auto-generated)
- Remove dead code: stripRunHighlight(), ispAnotation2Id, unused
  highlight/style fields on replace_annotation
</commit_message>
<xml_diff>
--- a/resources/isp-reference.docx
+++ b/resources/isp-reference.docx
@@ -204,9 +204,96 @@
       <w:r>
         <w:rPr>
           <w:b w:val="false"/>
+        </w:rPr>
+        <w:t xml:space="preserve">{{{for_citation_ru}}}</w:t>
+      </w:r>
+      <w:r>
+        <w:rPr>
+          <w:b w:val="false"/>
           <w:highlight w:val="yellow"/>
         </w:rPr>
-        <w:t xml:space="preserve">{{{for_citation_ru}}}</w:t>
+        <w:t xml:space="preserve">Труды ИСП РАН, том 37, вып. 1, 2025 г., стр. </w:t>
+      </w:r>
+      <w:r>
+        <w:rPr>
+          <w:b w:val="false"/>
+          <w:highlight w:val="yellow"/>
+          <w:lang w:val="en-US"/>
+        </w:rPr>
+        <w:t>xx</w:t>
+      </w:r>
+      <w:r>
+        <w:rPr>
+          <w:b w:val="false"/>
+          <w:highlight w:val="yellow"/>
+        </w:rPr>
+        <w:t>–</w:t>
+      </w:r>
+      <w:r>
+        <w:rPr>
+          <w:b w:val="false"/>
+          <w:highlight w:val="yellow"/>
+          <w:lang w:val="en-US"/>
+        </w:rPr>
+        <w:t>xx</w:t>
+      </w:r>
+      <w:r>
+        <w:rPr>
+          <w:b w:val="false"/>
+          <w:highlight w:val="yellow"/>
+        </w:rPr>
+        <w:t>. DOI: 10.15514/ISPRAS–20</w:t>
+      </w:r>
+      <w:r>
+        <w:rPr>
+          <w:b w:val="false"/>
+          <w:highlight w:val="yellow"/>
+          <w:lang w:val="en-US"/>
+        </w:rPr>
+        <w:t>25</w:t>
+      </w:r>
+      <w:r>
+        <w:rPr>
+          <w:b w:val="false"/>
+          <w:highlight w:val="yellow"/>
+        </w:rPr>
+        <w:t>–</w:t>
+      </w:r>
+      <w:r>
+        <w:rPr>
+          <w:b w:val="false"/>
+          <w:highlight w:val="yellow"/>
+          <w:lang w:val="en-US"/>
+        </w:rPr>
+        <w:t>37</w:t>
+      </w:r>
+      <w:r>
+        <w:rPr>
+          <w:b w:val="false"/>
+          <w:highlight w:val="yellow"/>
+        </w:rPr>
+        <w:t>(</w:t>
+      </w:r>
+      <w:r>
+        <w:rPr>
+          <w:b w:val="false"/>
+          <w:highlight w:val="yellow"/>
+          <w:lang w:val="en-US"/>
+        </w:rPr>
+        <w:t>1</w:t>
+      </w:r>
+      <w:r>
+        <w:rPr>
+          <w:b w:val="false"/>
+          <w:highlight w:val="yellow"/>
+        </w:rPr>
+        <w:t>)–1</w:t>
+      </w:r>
+      <w:r>
+        <w:rPr>
+          <w:b w:val="false"/>
+        </w:rPr>
+        <w:t>.</w:t>
       </w:r>
     </w:p>
     <w:p>
@@ -317,7 +404,7 @@
     </w:p>
     <w:p>
       <w:pPr>
-        <w:pStyle w:val="ispAnotation21"/>
+        <w:pStyle w:val="ispAnotation1"/>
         <w:spacing w:beforeAutospacing="0" w:before="240" w:afterAutospacing="0" w:after="120"/>
         <w:rPr>
           <w:b w:val="false"/>
@@ -338,7 +425,7 @@
     </w:p>
     <w:p>
       <w:pPr>
-        <w:pStyle w:val="ispAnotation21"/>
+        <w:pStyle w:val="Normal"/>
         <w:spacing w:before="120" w:after="30"/>
         <w:jc w:val="both"/>
         <w:rPr>
@@ -362,7 +449,7 @@
     </w:p>
     <w:p>
       <w:pPr>
-        <w:pStyle w:val="ispAnotation21"/>
+        <w:pStyle w:val="Normal"/>
         <w:spacing w:before="120" w:after="30"/>
         <w:jc w:val="both"/>
         <w:rPr>
@@ -380,14 +467,47 @@
       <w:r>
         <w:rPr>
           <w:b w:val="false"/>
-          <w:highlight w:val="yellow"/>
         </w:rPr>
         <w:t xml:space="preserve">{{{for_citation_en}}}</w:t>
       </w:r>
+      <w:r>
+        <w:rPr>
+          <w:iCs/>
+          <w:sz w:val="18"/>
+          <w:szCs w:val="18"/>
+          <w:lang w:val="en-US"/>
+        </w:rPr>
+        <w:t>Trudy ISP RAN/Proc. ISP RAS</w:t>
+      </w:r>
+      <w:r>
+        <w:rPr>
+          <w:sz w:val="18"/>
+          <w:szCs w:val="18"/>
+          <w:lang w:val="en-US"/>
+        </w:rPr>
+        <w:t xml:space="preserve">, </w:t>
+      </w:r>
+      <w:r>
+        <w:rPr>
+          <w:sz w:val="18"/>
+          <w:szCs w:val="18"/>
+          <w:highlight w:val="yellow"/>
+          <w:lang w:val="en-US"/>
+        </w:rPr>
+        <w:t>vol. 37, issue 1, 2025, pp. xx-xx (in Russian). DOI: 10.15514/ISPRAS-2025-37(1)-1</w:t>
+      </w:r>
+      <w:r>
+        <w:rPr>
+          <w:sz w:val="18"/>
+          <w:szCs w:val="18"/>
+          <w:lang w:val="en-US"/>
+        </w:rPr>
+        <w:t>.</w:t>
+      </w:r>
     </w:p>
     <w:p>
       <w:pPr>
-        <w:pStyle w:val="ispAnotation21"/>
+        <w:pStyle w:val="Normal"/>
         <w:spacing w:before="120" w:after="30"/>
         <w:jc w:val="both"/>
         <w:rPr>
@@ -677,7 +797,58 @@
       </w:rPr>
       <w:t xml:space="preserve">{{{page_header_en}}}</w:t>
     </w:r>
-    <w:r/>
+    <w:r>
+      <w:rPr>
+        <w:i/>
+        <w:iCs/>
+        <w:sz w:val="14"/>
+        <w:szCs w:val="14"/>
+        <w:lang w:val="en-US"/>
+      </w:rPr>
+      <w:t>Trudy ISP RAN/Proc. ISP RAS</w:t>
+    </w:r>
+    <w:r>
+      <w:rPr>
+        <w:sz w:val="14"/>
+        <w:szCs w:val="14"/>
+        <w:lang w:val="en-US"/>
+      </w:rPr>
+      <w:t xml:space="preserve">, </w:t>
+    </w:r>
+    <w:r>
+      <w:rPr>
+        <w:sz w:val="14"/>
+        <w:szCs w:val="14"/>
+        <w:highlight w:val="yellow"/>
+        <w:lang w:val="en-US"/>
+      </w:rPr>
+      <w:t>vol. 37,</w:t>
+    </w:r>
+    <w:r>
+      <w:rPr>
+        <w:sz w:val="14"/>
+        <w:szCs w:val="14"/>
+        <w:lang w:val="en-US"/>
+      </w:rPr>
+      <w:t xml:space="preserve"> </w:t>
+    </w:r>
+    <w:r>
+      <w:rPr>
+        <w:sz w:val="14"/>
+        <w:szCs w:val="14"/>
+        <w:highlight w:val="yellow"/>
+        <w:lang w:val="en-US"/>
+      </w:rPr>
+      <w:t>issue 1, 2025. pp. xx-</w:t>
+    </w:r>
+    <w:r>
+      <w:rPr>
+        <w:sz w:val="14"/>
+        <w:szCs w:val="14"/>
+        <w:lang w:val="en-US"/>
+      </w:rPr>
+      <w:t>xx.</w:t>
+    </w:r>
   </w:p>
 </w:hdr>
 </file>
@@ -703,7 +874,64 @@
       </w:rPr>
       <w:t xml:space="preserve">{{{page_header_ru}}}</w:t>
     </w:r>
-    <w:r/>
+    <w:r>
+      <w:rPr>
+        <w:i/>
+        <w:iCs/>
+        <w:sz w:val="14"/>
+        <w:szCs w:val="14"/>
+      </w:rPr>
+      <w:t>Труды ИСП РАН</w:t>
+    </w:r>
+    <w:r>
+      <w:rPr>
+        <w:sz w:val="14"/>
+        <w:szCs w:val="14"/>
+      </w:rPr>
+      <w:t xml:space="preserve">, 2025, </w:t>
+    </w:r>
+    <w:r>
+      <w:rPr>
+        <w:sz w:val="14"/>
+        <w:szCs w:val="14"/>
+        <w:highlight w:val="yellow"/>
+      </w:rPr>
+      <w:t xml:space="preserve">том 37 вып. 1, с. </w:t>
+    </w:r>
+    <w:r>
+      <w:rPr>
+        <w:sz w:val="14"/>
+        <w:szCs w:val="14"/>
+        <w:highlight w:val="yellow"/>
+        <w:lang w:val="en-US"/>
+      </w:rPr>
+      <w:t>xx</w:t>
+    </w:r>
+    <w:r>
+      <w:rPr>
+        <w:sz w:val="14"/>
+        <w:szCs w:val="14"/>
+        <w:highlight w:val="yellow"/>
+      </w:rPr>
+      <w:t>-</w:t>
+    </w:r>
+    <w:r>
+      <w:rPr>
+        <w:sz w:val="14"/>
+        <w:szCs w:val="14"/>
+        <w:highlight w:val="yellow"/>
+        <w:lang w:val="en-US"/>
+      </w:rPr>
+      <w:t>xx</w:t>
+    </w:r>
+    <w:r>
+      <w:rPr>
+        <w:sz w:val="14"/>
+        <w:szCs w:val="14"/>
+        <w:highlight w:val="yellow"/>
+      </w:rPr>
+      <w:t>.</w:t>
+    </w:r>
   </w:p>
 </w:hdr>
 </file>

</xml_diff>

<commit_message>
Wire up ispAnotation2 style override for EN annotation paragraphs
The ispAnotation2 style was referenced in EN annotation role assignments
but never actually applied — the style property was missing from the
ParagraphRole type and not consumed in the replace_annotation /
replace_citation handlers.

- Add ispAnotation2 style lookup from the template's style map
- Add style? field to ParagraphRole type for replace_annotation/replace_citation
- Add setStyle() helper to override paragraph style in the output XML
- Apply style in replace_annotation and replace_citation handlers
- Add ensureRunNotBold() to prevent citation suffix runs from inheriting
  bold from the ispAnotation2 style (which inherits w:b from ispAnotation)
</commit_message>
<xml_diff>
--- a/resources/isp-reference.docx
+++ b/resources/isp-reference.docx
@@ -404,7 +404,7 @@
     </w:p>
     <w:p>
       <w:pPr>
-        <w:pStyle w:val="ispAnotation1"/>
+        <w:pStyle w:val="ispAnotation21"/>
         <w:spacing w:beforeAutospacing="0" w:before="240" w:afterAutospacing="0" w:after="120"/>
         <w:rPr>
           <w:b w:val="false"/>
@@ -425,7 +425,7 @@
     </w:p>
     <w:p>
       <w:pPr>
-        <w:pStyle w:val="Normal"/>
+        <w:pStyle w:val="ispAnotation21"/>
         <w:spacing w:before="120" w:after="30"/>
         <w:jc w:val="both"/>
         <w:rPr>
@@ -449,7 +449,7 @@
     </w:p>
     <w:p>
       <w:pPr>
-        <w:pStyle w:val="Normal"/>
+        <w:pStyle w:val="ispAnotation21"/>
         <w:spacing w:before="120" w:after="30"/>
         <w:jc w:val="both"/>
         <w:rPr>
@@ -476,6 +476,7 @@
           <w:sz w:val="18"/>
           <w:szCs w:val="18"/>
           <w:lang w:val="en-US"/>
+          <w:b w:val="false"/>
         </w:rPr>
         <w:t>Trudy ISP RAN/Proc. ISP RAS</w:t>
       </w:r>
@@ -484,6 +485,7 @@
           <w:sz w:val="18"/>
           <w:szCs w:val="18"/>
           <w:lang w:val="en-US"/>
+          <w:b w:val="false"/>
         </w:rPr>
         <w:t xml:space="preserve">, </w:t>
       </w:r>
@@ -493,6 +495,7 @@
           <w:szCs w:val="18"/>
           <w:highlight w:val="yellow"/>
           <w:lang w:val="en-US"/>
+          <w:b w:val="false"/>
         </w:rPr>
         <w:t>vol. 37, issue 1, 2025, pp. xx-xx (in Russian). DOI: 10.15514/ISPRAS-2025-37(1)-1</w:t>
       </w:r>
@@ -501,13 +504,14 @@
           <w:sz w:val="18"/>
           <w:szCs w:val="18"/>
           <w:lang w:val="en-US"/>
+          <w:b w:val="false"/>
         </w:rPr>
         <w:t>.</w:t>
       </w:r>
     </w:p>
     <w:p>
       <w:pPr>
-        <w:pStyle w:val="Normal"/>
+        <w:pStyle w:val="ispAnotation21"/>
         <w:spacing w:before="120" w:after="30"/>
         <w:jc w:val="both"/>
         <w:rPr>

</xml_diff>

<commit_message>
Fix simple inconsistencies in the official template
</commit_message>
<xml_diff>
--- a/resources/isp-reference.docx
+++ b/resources/isp-reference.docx
@@ -36,11 +36,11 @@
             <wp:effectExtent l="0" t="0" r="0" b="0"/>
             <wp:wrapThrough wrapText="bothSides">
               <wp:wrapPolygon edited="0">
-                <wp:start x="-112" y="0"/>
-                <wp:lineTo x="-112" y="20571"/>
+                <wp:start x="-226" y="0"/>
+                <wp:lineTo x="-226" y="20571"/>
                 <wp:lineTo x="21199" y="20571"/>
                 <wp:lineTo x="21199" y="0"/>
-                <wp:lineTo x="-112" y="0"/>
+                <wp:lineTo x="-226" y="0"/>
               </wp:wrapPolygon>
             </wp:wrapThrough>
             <wp:docPr id="1" name="Рисунок 2"/>
@@ -7576,137 +7576,153 @@
   <w:abstractNum w:abstractNumId="51">
     <w:lvl w:ilvl="0">
       <w:start w:val="1"/>
-      <w:numFmt w:val="decimal"/>
-      <w:lvlText w:val="[%1]."/>
-      <w:lvlJc w:val="right"/>
-      <w:pPr>
-        <w:tabs>
-          <w:tab w:val="num" w:pos="360"/>
-        </w:tabs>
-        <w:ind w:left="360" w:hanging="72"/>
-      </w:pPr>
-      <w:rPr/>
+      <w:numFmt w:val="bullet"/>
+      <w:lvlText w:val=""/>
+      <w:lvlJc w:val="left"/>
+      <w:pPr>
+        <w:tabs>
+          <w:tab w:val="num" w:pos="0"/>
+        </w:tabs>
+        <w:ind w:left="720" w:hanging="360"/>
+      </w:pPr>
+      <w:rPr>
+        <w:rFonts w:ascii="Symbol" w:hAnsi="Symbol" w:cs="Symbol" w:hint="default"/>
+      </w:rPr>
     </w:lvl>
     <w:lvl w:ilvl="1">
       <w:start w:val="1"/>
-      <w:numFmt w:val="decimal"/>
-      <w:lvlText w:val="%1.%2."/>
-      <w:lvlJc w:val="left"/>
-      <w:pPr>
-        <w:tabs>
-          <w:tab w:val="num" w:pos="357"/>
-        </w:tabs>
-        <w:ind w:left="357" w:hanging="357"/>
-      </w:pPr>
-      <w:rPr/>
+      <w:numFmt w:val="bullet"/>
+      <w:lvlText w:val="o"/>
+      <w:lvlJc w:val="left"/>
+      <w:pPr>
+        <w:tabs>
+          <w:tab w:val="num" w:pos="0"/>
+        </w:tabs>
+        <w:ind w:left="1440" w:hanging="360"/>
+      </w:pPr>
+      <w:rPr>
+        <w:rFonts w:ascii="Courier New" w:hAnsi="Courier New" w:cs="Courier New" w:hint="default"/>
+      </w:rPr>
     </w:lvl>
     <w:lvl w:ilvl="2">
       <w:start w:val="1"/>
-      <w:numFmt w:val="decimal"/>
-      <w:lvlText w:val="%1.%2.%3."/>
-      <w:lvlJc w:val="left"/>
-      <w:pPr>
-        <w:tabs>
-          <w:tab w:val="num" w:pos="1224"/>
-        </w:tabs>
-        <w:ind w:left="1224" w:hanging="504"/>
-      </w:pPr>
-      <w:rPr/>
+      <w:numFmt w:val="bullet"/>
+      <w:lvlText w:val=""/>
+      <w:lvlJc w:val="left"/>
+      <w:pPr>
+        <w:tabs>
+          <w:tab w:val="num" w:pos="0"/>
+        </w:tabs>
+        <w:ind w:left="2160" w:hanging="360"/>
+      </w:pPr>
+      <w:rPr>
+        <w:rFonts w:ascii="Wingdings" w:hAnsi="Wingdings" w:cs="Wingdings" w:hint="default"/>
+      </w:rPr>
     </w:lvl>
     <w:lvl w:ilvl="3">
       <w:start w:val="1"/>
-      <w:numFmt w:val="decimal"/>
-      <w:lvlText w:val="%1.%2.%3.%4."/>
-      <w:lvlJc w:val="left"/>
-      <w:pPr>
-        <w:tabs>
-          <w:tab w:val="num" w:pos="1728"/>
-        </w:tabs>
-        <w:ind w:left="1728" w:hanging="648"/>
-      </w:pPr>
-      <w:rPr/>
+      <w:numFmt w:val="bullet"/>
+      <w:lvlText w:val=""/>
+      <w:lvlJc w:val="left"/>
+      <w:pPr>
+        <w:tabs>
+          <w:tab w:val="num" w:pos="0"/>
+        </w:tabs>
+        <w:ind w:left="2880" w:hanging="360"/>
+      </w:pPr>
+      <w:rPr>
+        <w:rFonts w:ascii="Symbol" w:hAnsi="Symbol" w:cs="Symbol" w:hint="default"/>
+      </w:rPr>
     </w:lvl>
     <w:lvl w:ilvl="4">
       <w:start w:val="1"/>
-      <w:numFmt w:val="decimal"/>
-      <w:lvlText w:val="%1.%2.%3.%4.%5."/>
-      <w:lvlJc w:val="left"/>
-      <w:pPr>
-        <w:tabs>
-          <w:tab w:val="num" w:pos="2232"/>
-        </w:tabs>
-        <w:ind w:left="2232" w:hanging="792"/>
-      </w:pPr>
-      <w:rPr/>
+      <w:numFmt w:val="bullet"/>
+      <w:lvlText w:val="o"/>
+      <w:lvlJc w:val="left"/>
+      <w:pPr>
+        <w:tabs>
+          <w:tab w:val="num" w:pos="0"/>
+        </w:tabs>
+        <w:ind w:left="3600" w:hanging="360"/>
+      </w:pPr>
+      <w:rPr>
+        <w:rFonts w:ascii="Courier New" w:hAnsi="Courier New" w:cs="Courier New" w:hint="default"/>
+      </w:rPr>
     </w:lvl>
     <w:lvl w:ilvl="5">
       <w:start w:val="1"/>
-      <w:numFmt w:val="decimal"/>
-      <w:lvlText w:val="%1.%2.%3.%4.%5.%6."/>
-      <w:lvlJc w:val="left"/>
-      <w:pPr>
-        <w:tabs>
-          <w:tab w:val="num" w:pos="2736"/>
-        </w:tabs>
-        <w:ind w:left="2736" w:hanging="936"/>
-      </w:pPr>
-      <w:rPr/>
+      <w:numFmt w:val="bullet"/>
+      <w:lvlText w:val=""/>
+      <w:lvlJc w:val="left"/>
+      <w:pPr>
+        <w:tabs>
+          <w:tab w:val="num" w:pos="0"/>
+        </w:tabs>
+        <w:ind w:left="4320" w:hanging="360"/>
+      </w:pPr>
+      <w:rPr>
+        <w:rFonts w:ascii="Wingdings" w:hAnsi="Wingdings" w:cs="Wingdings" w:hint="default"/>
+      </w:rPr>
     </w:lvl>
     <w:lvl w:ilvl="6">
       <w:start w:val="1"/>
-      <w:numFmt w:val="decimal"/>
-      <w:lvlText w:val="%1.%2.%3.%4.%5.%6.%7."/>
-      <w:lvlJc w:val="left"/>
-      <w:pPr>
-        <w:tabs>
-          <w:tab w:val="num" w:pos="3240"/>
-        </w:tabs>
-        <w:ind w:left="3240" w:hanging="1080"/>
-      </w:pPr>
-      <w:rPr/>
+      <w:numFmt w:val="bullet"/>
+      <w:lvlText w:val=""/>
+      <w:lvlJc w:val="left"/>
+      <w:pPr>
+        <w:tabs>
+          <w:tab w:val="num" w:pos="0"/>
+        </w:tabs>
+        <w:ind w:left="5040" w:hanging="360"/>
+      </w:pPr>
+      <w:rPr>
+        <w:rFonts w:ascii="Symbol" w:hAnsi="Symbol" w:cs="Symbol" w:hint="default"/>
+      </w:rPr>
     </w:lvl>
     <w:lvl w:ilvl="7">
       <w:start w:val="1"/>
-      <w:numFmt w:val="decimal"/>
-      <w:lvlText w:val="%1.%2.%3.%4.%5.%6.%7.%8."/>
-      <w:lvlJc w:val="left"/>
-      <w:pPr>
-        <w:tabs>
-          <w:tab w:val="num" w:pos="3744"/>
-        </w:tabs>
-        <w:ind w:left="3744" w:hanging="1224"/>
-      </w:pPr>
-      <w:rPr/>
+      <w:numFmt w:val="bullet"/>
+      <w:lvlText w:val="o"/>
+      <w:lvlJc w:val="left"/>
+      <w:pPr>
+        <w:tabs>
+          <w:tab w:val="num" w:pos="0"/>
+        </w:tabs>
+        <w:ind w:left="5760" w:hanging="360"/>
+      </w:pPr>
+      <w:rPr>
+        <w:rFonts w:ascii="Courier New" w:hAnsi="Courier New" w:cs="Courier New" w:hint="default"/>
+      </w:rPr>
     </w:lvl>
     <w:lvl w:ilvl="8">
       <w:start w:val="1"/>
-      <w:numFmt w:val="decimal"/>
-      <w:lvlText w:val="%1.%2.%3.%4.%5.%6.%7.%8.%9."/>
-      <w:lvlJc w:val="left"/>
-      <w:pPr>
-        <w:tabs>
-          <w:tab w:val="num" w:pos="4320"/>
-        </w:tabs>
-        <w:ind w:left="4320" w:hanging="1440"/>
-      </w:pPr>
-      <w:rPr/>
+      <w:numFmt w:val="bullet"/>
+      <w:lvlText w:val=""/>
+      <w:lvlJc w:val="left"/>
+      <w:pPr>
+        <w:tabs>
+          <w:tab w:val="num" w:pos="0"/>
+        </w:tabs>
+        <w:ind w:left="6480" w:hanging="360"/>
+      </w:pPr>
+      <w:rPr>
+        <w:rFonts w:ascii="Wingdings" w:hAnsi="Wingdings" w:cs="Wingdings" w:hint="default"/>
+      </w:rPr>
     </w:lvl>
   </w:abstractNum>
   <w:abstractNum w:abstractNumId="52">
     <w:lvl w:ilvl="0">
       <w:start w:val="1"/>
-      <w:numFmt w:val="bullet"/>
-      <w:lvlText w:val=""/>
-      <w:lvlJc w:val="left"/>
+      <w:numFmt w:val="decimal"/>
+      <w:lvlText w:val="%1)"/>
+      <w:lvlJc w:val="right"/>
       <w:pPr>
         <w:tabs>
           <w:tab w:val="num" w:pos="0"/>
         </w:tabs>
         <w:ind w:left="720" w:hanging="360"/>
       </w:pPr>
-      <w:rPr>
-        <w:rFonts w:ascii="Symbol" w:hAnsi="Symbol" w:cs="Symbol" w:hint="default"/>
-      </w:rPr>
+      <w:rPr/>
     </w:lvl>
     <w:lvl w:ilvl="1">
       <w:start w:val="1"/>
@@ -7833,135 +7849,119 @@
     <w:lvl w:ilvl="0">
       <w:start w:val="1"/>
       <w:numFmt w:val="decimal"/>
-      <w:lvlText w:val="%1)"/>
+      <w:lvlText w:val="[%1]."/>
       <w:lvlJc w:val="right"/>
       <w:pPr>
         <w:tabs>
-          <w:tab w:val="num" w:pos="0"/>
-        </w:tabs>
-        <w:ind w:left="720" w:hanging="360"/>
+          <w:tab w:val="num" w:pos="360"/>
+        </w:tabs>
+        <w:ind w:left="360" w:hanging="72"/>
       </w:pPr>
       <w:rPr/>
     </w:lvl>
     <w:lvl w:ilvl="1">
       <w:start w:val="1"/>
-      <w:numFmt w:val="bullet"/>
-      <w:lvlText w:val="o"/>
-      <w:lvlJc w:val="left"/>
-      <w:pPr>
-        <w:tabs>
-          <w:tab w:val="num" w:pos="0"/>
-        </w:tabs>
-        <w:ind w:left="1440" w:hanging="360"/>
-      </w:pPr>
-      <w:rPr>
-        <w:rFonts w:ascii="Courier New" w:hAnsi="Courier New" w:cs="Courier New" w:hint="default"/>
-      </w:rPr>
+      <w:numFmt w:val="decimal"/>
+      <w:lvlText w:val="%1.%2."/>
+      <w:lvlJc w:val="left"/>
+      <w:pPr>
+        <w:tabs>
+          <w:tab w:val="num" w:pos="357"/>
+        </w:tabs>
+        <w:ind w:left="357" w:hanging="357"/>
+      </w:pPr>
+      <w:rPr/>
     </w:lvl>
     <w:lvl w:ilvl="2">
       <w:start w:val="1"/>
-      <w:numFmt w:val="bullet"/>
-      <w:lvlText w:val=""/>
-      <w:lvlJc w:val="left"/>
-      <w:pPr>
-        <w:tabs>
-          <w:tab w:val="num" w:pos="0"/>
-        </w:tabs>
-        <w:ind w:left="2160" w:hanging="360"/>
-      </w:pPr>
-      <w:rPr>
-        <w:rFonts w:ascii="Wingdings" w:hAnsi="Wingdings" w:cs="Wingdings" w:hint="default"/>
-      </w:rPr>
+      <w:numFmt w:val="decimal"/>
+      <w:lvlText w:val="%1.%2.%3."/>
+      <w:lvlJc w:val="left"/>
+      <w:pPr>
+        <w:tabs>
+          <w:tab w:val="num" w:pos="1224"/>
+        </w:tabs>
+        <w:ind w:left="1224" w:hanging="504"/>
+      </w:pPr>
+      <w:rPr/>
     </w:lvl>
     <w:lvl w:ilvl="3">
       <w:start w:val="1"/>
-      <w:numFmt w:val="bullet"/>
-      <w:lvlText w:val=""/>
-      <w:lvlJc w:val="left"/>
-      <w:pPr>
-        <w:tabs>
-          <w:tab w:val="num" w:pos="0"/>
-        </w:tabs>
-        <w:ind w:left="2880" w:hanging="360"/>
-      </w:pPr>
-      <w:rPr>
-        <w:rFonts w:ascii="Symbol" w:hAnsi="Symbol" w:cs="Symbol" w:hint="default"/>
-      </w:rPr>
+      <w:numFmt w:val="decimal"/>
+      <w:lvlText w:val="%1.%2.%3.%4."/>
+      <w:lvlJc w:val="left"/>
+      <w:pPr>
+        <w:tabs>
+          <w:tab w:val="num" w:pos="1728"/>
+        </w:tabs>
+        <w:ind w:left="1728" w:hanging="648"/>
+      </w:pPr>
+      <w:rPr/>
     </w:lvl>
     <w:lvl w:ilvl="4">
       <w:start w:val="1"/>
-      <w:numFmt w:val="bullet"/>
-      <w:lvlText w:val="o"/>
-      <w:lvlJc w:val="left"/>
-      <w:pPr>
-        <w:tabs>
-          <w:tab w:val="num" w:pos="0"/>
-        </w:tabs>
-        <w:ind w:left="3600" w:hanging="360"/>
-      </w:pPr>
-      <w:rPr>
-        <w:rFonts w:ascii="Courier New" w:hAnsi="Courier New" w:cs="Courier New" w:hint="default"/>
-      </w:rPr>
+      <w:numFmt w:val="decimal"/>
+      <w:lvlText w:val="%1.%2.%3.%4.%5."/>
+      <w:lvlJc w:val="left"/>
+      <w:pPr>
+        <w:tabs>
+          <w:tab w:val="num" w:pos="2232"/>
+        </w:tabs>
+        <w:ind w:left="2232" w:hanging="792"/>
+      </w:pPr>
+      <w:rPr/>
     </w:lvl>
     <w:lvl w:ilvl="5">
       <w:start w:val="1"/>
-      <w:numFmt w:val="bullet"/>
-      <w:lvlText w:val=""/>
-      <w:lvlJc w:val="left"/>
-      <w:pPr>
-        <w:tabs>
-          <w:tab w:val="num" w:pos="0"/>
-        </w:tabs>
-        <w:ind w:left="4320" w:hanging="360"/>
-      </w:pPr>
-      <w:rPr>
-        <w:rFonts w:ascii="Wingdings" w:hAnsi="Wingdings" w:cs="Wingdings" w:hint="default"/>
-      </w:rPr>
+      <w:numFmt w:val="decimal"/>
+      <w:lvlText w:val="%1.%2.%3.%4.%5.%6."/>
+      <w:lvlJc w:val="left"/>
+      <w:pPr>
+        <w:tabs>
+          <w:tab w:val="num" w:pos="2736"/>
+        </w:tabs>
+        <w:ind w:left="2736" w:hanging="936"/>
+      </w:pPr>
+      <w:rPr/>
     </w:lvl>
     <w:lvl w:ilvl="6">
       <w:start w:val="1"/>
-      <w:numFmt w:val="bullet"/>
-      <w:lvlText w:val=""/>
-      <w:lvlJc w:val="left"/>
-      <w:pPr>
-        <w:tabs>
-          <w:tab w:val="num" w:pos="0"/>
-        </w:tabs>
-        <w:ind w:left="5040" w:hanging="360"/>
-      </w:pPr>
-      <w:rPr>
-        <w:rFonts w:ascii="Symbol" w:hAnsi="Symbol" w:cs="Symbol" w:hint="default"/>
-      </w:rPr>
+      <w:numFmt w:val="decimal"/>
+      <w:lvlText w:val="%1.%2.%3.%4.%5.%6.%7."/>
+      <w:lvlJc w:val="left"/>
+      <w:pPr>
+        <w:tabs>
+          <w:tab w:val="num" w:pos="3240"/>
+        </w:tabs>
+        <w:ind w:left="3240" w:hanging="1080"/>
+      </w:pPr>
+      <w:rPr/>
     </w:lvl>
     <w:lvl w:ilvl="7">
       <w:start w:val="1"/>
-      <w:numFmt w:val="bullet"/>
-      <w:lvlText w:val="o"/>
-      <w:lvlJc w:val="left"/>
-      <w:pPr>
-        <w:tabs>
-          <w:tab w:val="num" w:pos="0"/>
-        </w:tabs>
-        <w:ind w:left="5760" w:hanging="360"/>
-      </w:pPr>
-      <w:rPr>
-        <w:rFonts w:ascii="Courier New" w:hAnsi="Courier New" w:cs="Courier New" w:hint="default"/>
-      </w:rPr>
+      <w:numFmt w:val="decimal"/>
+      <w:lvlText w:val="%1.%2.%3.%4.%5.%6.%7.%8."/>
+      <w:lvlJc w:val="left"/>
+      <w:pPr>
+        <w:tabs>
+          <w:tab w:val="num" w:pos="3744"/>
+        </w:tabs>
+        <w:ind w:left="3744" w:hanging="1224"/>
+      </w:pPr>
+      <w:rPr/>
     </w:lvl>
     <w:lvl w:ilvl="8">
       <w:start w:val="1"/>
-      <w:numFmt w:val="bullet"/>
-      <w:lvlText w:val=""/>
-      <w:lvlJc w:val="left"/>
-      <w:pPr>
-        <w:tabs>
-          <w:tab w:val="num" w:pos="0"/>
-        </w:tabs>
-        <w:ind w:left="6480" w:hanging="360"/>
-      </w:pPr>
-      <w:rPr>
-        <w:rFonts w:ascii="Wingdings" w:hAnsi="Wingdings" w:cs="Wingdings" w:hint="default"/>
-      </w:rPr>
+      <w:numFmt w:val="decimal"/>
+      <w:lvlText w:val="%1.%2.%3.%4.%5.%6.%7.%8.%9."/>
+      <w:lvlJc w:val="left"/>
+      <w:pPr>
+        <w:tabs>
+          <w:tab w:val="num" w:pos="4320"/>
+        </w:tabs>
+        <w:ind w:left="4320" w:hanging="1440"/>
+      </w:pPr>
+      <w:rPr/>
     </w:lvl>
   </w:abstractNum>
   <w:abstractNum w:abstractNumId="54">

</xml_diff>

<commit_message>
Use ispAnotation style for EN annotation paragraphs
Fix ~4pt vertical offset on page 2 between sample.docx and official.docx.
The EN Keywords, For citation, and Acknowledgements paragraphs in the
official template used Normal style while the converter produced
ispAnotation. Changed official.docx to use ispAnotation1 with after=120
and explicit w:b val="false" on body runs. Updated generate-reference.ts
to apply ispAnotation (not ispAnotation2) for EN annotations, and changed
Acknowledgements prefix from "." to ":".
</commit_message>
<xml_diff>
--- a/resources/isp-reference.docx
+++ b/resources/isp-reference.docx
@@ -36,11 +36,11 @@
             <wp:effectExtent l="0" t="0" r="0" b="0"/>
             <wp:wrapThrough wrapText="bothSides">
               <wp:wrapPolygon edited="0">
-                <wp:start x="-226" y="0"/>
-                <wp:lineTo x="-226" y="20571"/>
+                <wp:start x="-283" y="0"/>
+                <wp:lineTo x="-283" y="20571"/>
                 <wp:lineTo x="21199" y="20571"/>
                 <wp:lineTo x="21199" y="0"/>
-                <wp:lineTo x="-226" y="0"/>
+                <wp:lineTo x="-283" y="0"/>
               </wp:wrapPolygon>
             </wp:wrapThrough>
             <wp:docPr id="1" name="Рисунок 2"/>
@@ -404,7 +404,7 @@
     </w:p>
     <w:p>
       <w:pPr>
-        <w:pStyle w:val="ispAnotation21"/>
+        <w:pStyle w:val="ispAnotation1"/>
         <w:spacing w:beforeAutospacing="0" w:before="240" w:afterAutospacing="0" w:after="120"/>
         <w:rPr>
           <w:b w:val="false"/>
@@ -425,8 +425,8 @@
     </w:p>
     <w:p>
       <w:pPr>
-        <w:pStyle w:val="ispAnotation21"/>
-        <w:spacing w:before="120" w:after="30"/>
+        <w:pStyle w:val="ispAnotation1"/>
+        <w:spacing w:before="120" w:after="120"/>
         <w:jc w:val="both"/>
         <w:rPr>
           <w:sz w:val="18"/>
@@ -449,8 +449,8 @@
     </w:p>
     <w:p>
       <w:pPr>
-        <w:pStyle w:val="ispAnotation21"/>
-        <w:spacing w:before="120" w:after="30"/>
+        <w:pStyle w:val="ispAnotation1"/>
+        <w:spacing w:before="120" w:after="120"/>
         <w:jc w:val="both"/>
         <w:rPr>
           <w:sz w:val="18"/>
@@ -472,47 +472,47 @@
       </w:r>
       <w:r>
         <w:rPr>
+          <w:b w:val="false"/>
           <w:iCs/>
           <w:sz w:val="18"/>
           <w:szCs w:val="18"/>
           <w:lang w:val="en-US"/>
-          <w:b w:val="false"/>
         </w:rPr>
         <w:t>Trudy ISP RAN/Proc. ISP RAS</w:t>
       </w:r>
       <w:r>
         <w:rPr>
+          <w:b w:val="false"/>
           <w:sz w:val="18"/>
           <w:szCs w:val="18"/>
           <w:lang w:val="en-US"/>
-          <w:b w:val="false"/>
         </w:rPr>
         <w:t xml:space="preserve">, </w:t>
       </w:r>
       <w:r>
         <w:rPr>
+          <w:b w:val="false"/>
           <w:sz w:val="18"/>
           <w:szCs w:val="18"/>
           <w:highlight w:val="yellow"/>
           <w:lang w:val="en-US"/>
-          <w:b w:val="false"/>
         </w:rPr>
         <w:t>vol. 37, issue 1, 2025, pp. xx-xx (in Russian). DOI: 10.15514/ISPRAS-2025-37(1)-1</w:t>
       </w:r>
       <w:r>
         <w:rPr>
+          <w:b w:val="false"/>
           <w:sz w:val="18"/>
           <w:szCs w:val="18"/>
           <w:lang w:val="en-US"/>
-          <w:b w:val="false"/>
         </w:rPr>
         <w:t>.</w:t>
       </w:r>
     </w:p>
     <w:p>
       <w:pPr>
-        <w:pStyle w:val="ispAnotation21"/>
-        <w:spacing w:before="120" w:after="30"/>
+        <w:pStyle w:val="ispAnotation1"/>
+        <w:spacing w:before="120" w:after="120"/>
         <w:jc w:val="both"/>
         <w:rPr>
           <w:sz w:val="18"/>
@@ -524,7 +524,7 @@
         <w:rPr>
           <w:b/>
         </w:rPr>
-        <w:t xml:space="preserve">Acknowledgements. </w:t>
+        <w:t xml:space="preserve">Acknowledgements: </w:t>
       </w:r>
       <w:r>
         <w:rPr>
@@ -631,10 +631,10 @@
           <w:pStyle w:val="Footer"/>
           <w:rPr/>
         </w:pPr>
-        <w:bookmarkStart w:id="15" w:name="_Hlk179284705"/>
-        <w:bookmarkStart w:id="16" w:name="_Hlk179284704"/>
-        <w:bookmarkStart w:id="17" w:name="_Hlk179284683"/>
-        <w:bookmarkStart w:id="18" w:name="_Hlk179284682"/>
+        <w:bookmarkStart w:id="15" w:name="_Hlk179284682"/>
+        <w:bookmarkStart w:id="16" w:name="_Hlk179284683"/>
+        <w:bookmarkStart w:id="17" w:name="_Hlk179284704"/>
+        <w:bookmarkStart w:id="18" w:name="_Hlk179284705"/>
         <w:r>
           <w:rPr/>
           <w:fldChar w:fldCharType="begin"/>
@@ -682,8 +682,8 @@
           <w:jc w:val="right"/>
           <w:rPr/>
         </w:pPr>
-        <w:bookmarkStart w:id="19" w:name="_Hlk179284736"/>
-        <w:bookmarkStart w:id="20" w:name="_Hlk179284735"/>
+        <w:bookmarkStart w:id="19" w:name="_Hlk179284735"/>
+        <w:bookmarkStart w:id="20" w:name="_Hlk179284736"/>
         <w:r>
           <w:rPr/>
           <w:fldChar w:fldCharType="begin"/>
@@ -729,8 +729,8 @@
           <w:jc w:val="right"/>
           <w:rPr/>
         </w:pPr>
-        <w:bookmarkStart w:id="21" w:name="_Hlk179284656"/>
-        <w:bookmarkStart w:id="22" w:name="_Hlk179284655"/>
+        <w:bookmarkStart w:id="21" w:name="_Hlk179284655"/>
+        <w:bookmarkStart w:id="22" w:name="_Hlk179284656"/>
         <w:r>
           <w:rPr/>
           <w:fldChar w:fldCharType="begin"/>
@@ -9070,8 +9070,8 @@
     <w:qFormat/>
     <w:rPr/>
   </w:style>
-  <w:style w:type="character" w:styleId="FootnoteCharactersuser">
-    <w:name w:val="Footnote Characters (user)"/>
+  <w:style w:type="character" w:styleId="FootnoteCharacters">
+    <w:name w:val="Footnote Characters"/>
     <w:uiPriority w:val="99"/>
     <w:semiHidden/>
     <w:qFormat/>
@@ -9080,8 +9080,8 @@
       <w:vertAlign w:val="superscript"/>
     </w:rPr>
   </w:style>
-  <w:style w:type="character" w:styleId="FootnoteCharacters" w:customStyle="1">
-    <w:name w:val="Footnote Characters"/>
+  <w:style w:type="character" w:styleId="FootnoteCharactersuser" w:customStyle="1">
+    <w:name w:val="Footnote Characters (user)"/>
     <w:qFormat/>
     <w:rsid w:val="00a34b03"/>
     <w:rPr>
@@ -9168,18 +9168,18 @@
       <w:lang w:val="de-DE" w:eastAsia="ar-SA" w:bidi="ar-SA"/>
     </w:rPr>
   </w:style>
+  <w:style w:type="character" w:styleId="EndnoteCharacters">
+    <w:name w:val="Endnote Characters"/>
+    <w:uiPriority w:val="99"/>
+    <w:semiHidden/>
+    <w:qFormat/>
+    <w:rsid w:val="00fa0032"/>
+    <w:rPr>
+      <w:vertAlign w:val="superscript"/>
+    </w:rPr>
+  </w:style>
   <w:style w:type="character" w:styleId="EndnoteCharactersuser">
     <w:name w:val="Endnote Characters (user)"/>
-    <w:uiPriority w:val="99"/>
-    <w:semiHidden/>
-    <w:qFormat/>
-    <w:rsid w:val="00fa0032"/>
-    <w:rPr>
-      <w:vertAlign w:val="superscript"/>
-    </w:rPr>
-  </w:style>
-  <w:style w:type="character" w:styleId="EndnoteCharacters">
-    <w:name w:val="Endnote Characters"/>
     <w:qFormat/>
     <w:rPr>
       <w:vertAlign w:val="superscript"/>

</xml_diff>

<commit_message>
Fix ordered list number-to-text spacing to match official template
Patch abstractNum 33 lvl 0 in generate-reference: set lvlJc to "right"
and tab pos to "0", matching the official template's abstractNum 52.
Also set explicit spacing and indentation on ordered list paragraphs.
</commit_message>
<xml_diff>
--- a/resources/isp-reference.docx
+++ b/resources/isp-reference.docx
@@ -5203,10 +5203,10 @@
       <w:start w:val="1"/>
       <w:numFmt w:val="decimal"/>
       <w:lvlText w:val="%1)"/>
-      <w:lvlJc w:val="left"/>
-      <w:pPr>
-        <w:tabs>
-          <w:tab w:val="num" w:pos="284"/>
+      <w:lvlJc w:val="right"/>
+      <w:pPr>
+        <w:tabs>
+          <w:tab w:val="num" w:pos="0"/>
         </w:tabs>
         <w:ind w:left="284" w:hanging="284"/>
       </w:pPr>

</xml_diff>

<commit_message>
Add 6pt spacing to author detail paragraphs matching official template
Author bio paragraphs now get w:spacing before="120" after="120" (6pt)
to match the official template. Also fixes inconsistencies in
test/official.docx paragraphs 107-108 (wrong style, red text, missing spacing).
</commit_message>
<xml_diff>
--- a/resources/isp-reference.docx
+++ b/resources/isp-reference.docx
@@ -36,11 +36,11 @@
             <wp:effectExtent l="0" t="0" r="0" b="0"/>
             <wp:wrapThrough wrapText="bothSides">
               <wp:wrapPolygon edited="0">
-                <wp:start x="-283" y="0"/>
-                <wp:lineTo x="-283" y="20571"/>
+                <wp:start x="-340" y="0"/>
+                <wp:lineTo x="-340" y="20571"/>
                 <wp:lineTo x="21199" y="20571"/>
                 <wp:lineTo x="21199" y="0"/>
-                <wp:lineTo x="-283" y="0"/>
+                <wp:lineTo x="-340" y="0"/>
               </wp:wrapPolygon>
             </wp:wrapThrough>
             <wp:docPr id="1" name="Рисунок 2"/>
@@ -631,10 +631,10 @@
           <w:pStyle w:val="Footer"/>
           <w:rPr/>
         </w:pPr>
-        <w:bookmarkStart w:id="15" w:name="_Hlk179284682"/>
-        <w:bookmarkStart w:id="16" w:name="_Hlk179284683"/>
-        <w:bookmarkStart w:id="17" w:name="_Hlk179284704"/>
-        <w:bookmarkStart w:id="18" w:name="_Hlk179284705"/>
+        <w:bookmarkStart w:id="15" w:name="_Hlk179284705"/>
+        <w:bookmarkStart w:id="16" w:name="_Hlk179284704"/>
+        <w:bookmarkStart w:id="17" w:name="_Hlk179284683"/>
+        <w:bookmarkStart w:id="18" w:name="_Hlk179284682"/>
         <w:r>
           <w:rPr/>
           <w:fldChar w:fldCharType="begin"/>
@@ -682,8 +682,8 @@
           <w:jc w:val="right"/>
           <w:rPr/>
         </w:pPr>
-        <w:bookmarkStart w:id="19" w:name="_Hlk179284735"/>
-        <w:bookmarkStart w:id="20" w:name="_Hlk179284736"/>
+        <w:bookmarkStart w:id="19" w:name="_Hlk179284736"/>
+        <w:bookmarkStart w:id="20" w:name="_Hlk179284735"/>
         <w:r>
           <w:rPr/>
           <w:fldChar w:fldCharType="begin"/>
@@ -729,8 +729,8 @@
           <w:jc w:val="right"/>
           <w:rPr/>
         </w:pPr>
-        <w:bookmarkStart w:id="21" w:name="_Hlk179284655"/>
-        <w:bookmarkStart w:id="22" w:name="_Hlk179284656"/>
+        <w:bookmarkStart w:id="21" w:name="_Hlk179284656"/>
+        <w:bookmarkStart w:id="22" w:name="_Hlk179284655"/>
         <w:r>
           <w:rPr/>
           <w:fldChar w:fldCharType="begin"/>
@@ -9070,8 +9070,8 @@
     <w:qFormat/>
     <w:rPr/>
   </w:style>
-  <w:style w:type="character" w:styleId="FootnoteCharacters">
-    <w:name w:val="Footnote Characters"/>
+  <w:style w:type="character" w:styleId="FootnoteCharactersuser">
+    <w:name w:val="Footnote Characters (user)"/>
     <w:uiPriority w:val="99"/>
     <w:semiHidden/>
     <w:qFormat/>
@@ -9080,8 +9080,8 @@
       <w:vertAlign w:val="superscript"/>
     </w:rPr>
   </w:style>
-  <w:style w:type="character" w:styleId="FootnoteCharactersuser" w:customStyle="1">
-    <w:name w:val="Footnote Characters (user)"/>
+  <w:style w:type="character" w:styleId="FootnoteCharacters" w:customStyle="1">
+    <w:name w:val="Footnote Characters"/>
     <w:qFormat/>
     <w:rsid w:val="00a34b03"/>
     <w:rPr>
@@ -9168,18 +9168,18 @@
       <w:lang w:val="de-DE" w:eastAsia="ar-SA" w:bidi="ar-SA"/>
     </w:rPr>
   </w:style>
+  <w:style w:type="character" w:styleId="EndnoteCharactersuser">
+    <w:name w:val="Endnote Characters (user)"/>
+    <w:uiPriority w:val="99"/>
+    <w:semiHidden/>
+    <w:qFormat/>
+    <w:rsid w:val="00fa0032"/>
+    <w:rPr>
+      <w:vertAlign w:val="superscript"/>
+    </w:rPr>
+  </w:style>
   <w:style w:type="character" w:styleId="EndnoteCharacters">
     <w:name w:val="Endnote Characters"/>
-    <w:uiPriority w:val="99"/>
-    <w:semiHidden/>
-    <w:qFormat/>
-    <w:rsid w:val="00fa0032"/>
-    <w:rPr>
-      <w:vertAlign w:val="superscript"/>
-    </w:rPr>
-  </w:style>
-  <w:style w:type="character" w:styleId="EndnoteCharactersuser">
-    <w:name w:val="Endnote Characters (user)"/>
     <w:qFormat/>
     <w:rPr>
       <w:vertAlign w:val="superscript"/>

</xml_diff>